<commit_message>
feat: calculate tax fields during review
Co-authored-by: Cursor <cursoragent@cursor.com>
</commit_message>
<xml_diff>
--- a/agent/contract/templates/zhanweifu/caigouhetong.docx
+++ b/agent/contract/templates/zhanweifu/caigouhetong.docx
@@ -1335,7 +1335,7 @@
         </w:rPr>
       </w:pPr>
       <w:r>
-        <w:t>本合同采用固定总价的计价方式，合同总价为¥{{ totalAmount }}元整（大写金额：{{ totalAmountChinese }}），含13%增值税，其中不含税金额{{ amountWithoutTax }}元，税金{{ taxAmount }}元。如在合同签订期间及合同签订后，相关增值税税率发生变化的，不含税金额保持不变，本合同增值税税率及税额相应调整。</w:t>
+        <w:t>本合同采用固定总价的计价方式，合同总价为¥{{ totalAmount }}元整（大写金额：{{ totalAmountChinese }}），含{{ taxRate }}%增值税，其中不含税金额{{ amountWithoutTax }}元，税金{{ taxAmount }}元。如在合同签订期间及合同签订后，相关增值税税率发生变化的，不含税金额保持不变，本合同增值税税率及税额相应调整。</w:t>
       </w:r>
     </w:p>
     <w:p>
@@ -2833,13 +2833,7 @@
         </w:rPr>
       </w:pPr>
       <w:r>
-        <w:rPr>
-          <w:rFonts w:ascii="Times New Roman" w:hAnsi="Times New Roman" w:eastAsia="仿宋" w:cs="Times New Roman"/>
-          <w:color w:val="auto"/>
-          <w:szCs w:val="21"/>
-          <w:highlight w:val="none"/>
-        </w:rPr>
-        <w:t>乙方在收款前应向甲方开具正规的13%增值税专用发票，否则甲方有权拒绝支付相应费用。若乙方提供不符合要求的发票（如虚开发票、假发票等），甲方将暂停支付全部应付款项，并要求乙方重新提供合格发票，因乙方发票问题造成的甲方损失均由乙方承担。如因此导致甲方被税务部门等行政机关处罚的，乙方另需支付合同金额50%的惩罚性违约金。</w:t>
+        <w:t>乙方在收款前应向甲方开具正规的{{ taxRate }}%增值税专用发票，否则甲方有权拒绝支付相应费用。若乙方提供不符合要求的发票（如虚开发票、假发票等），甲方将暂停支付全部应付款项，并要求乙方重新提供合格发票，因乙方发票问题造成的甲方损失均由乙方承担。如因此导致甲方被税务部门等行政机关处罚的，乙方另需支付合同金额50%的惩罚性违约金。</w:t>
       </w:r>
     </w:p>
     <w:p>

</xml_diff>

<commit_message>
fix: render equipment table items vertically
Co-authored-by: Cursor <cursoragent@cursor.com>
</commit_message>
<xml_diff>
--- a/agent/contract/templates/zhanweifu/caigouhetong.docx
+++ b/agent/contract/templates/zhanweifu/caigouhetong.docx
@@ -1022,7 +1022,156 @@
           </w:tcPr>
           <w:p>
             <w:r>
-              <w:t>{% for item in items %}{{ item.index }}</w:t>
+              <w:t>{%tr for item in items %}</w:t>
+            </w:r>
+          </w:p>
+        </w:tc>
+        <w:tc>
+          <w:tcPr>
+            <w:tcW w:w="1323" w:type="dxa"/>
+            <w:tcBorders>
+              <w:top w:val="single" w:color="000000" w:sz="4" w:space="0"/>
+              <w:left w:val="single" w:color="000000" w:sz="4" w:space="0"/>
+              <w:right w:val="single" w:color="000000" w:sz="4" w:space="0"/>
+            </w:tcBorders>
+            <w:vAlign w:val="center"/>
+          </w:tcPr>
+          <w:p>
+            <w:r>
+              <w:t/>
+            </w:r>
+          </w:p>
+        </w:tc>
+        <w:tc>
+          <w:tcPr>
+            <w:tcW w:w="2154" w:type="dxa"/>
+            <w:tcBorders>
+              <w:top w:val="single" w:color="000000" w:sz="4" w:space="0"/>
+              <w:left w:val="single" w:color="000000" w:sz="4" w:space="0"/>
+              <w:bottom w:val="single" w:color="000000" w:sz="4" w:space="0"/>
+              <w:right w:val="single" w:color="000000" w:sz="4" w:space="0"/>
+            </w:tcBorders>
+            <w:vAlign w:val="center"/>
+          </w:tcPr>
+          <w:p>
+            <w:r>
+              <w:t/>
+            </w:r>
+          </w:p>
+        </w:tc>
+        <w:tc>
+          <w:tcPr>
+            <w:tcW w:w="743" w:type="dxa"/>
+            <w:tcBorders>
+              <w:top w:val="single" w:color="000000" w:sz="4" w:space="0"/>
+              <w:left w:val="single" w:color="000000" w:sz="4" w:space="0"/>
+              <w:bottom w:val="single" w:color="000000" w:sz="4" w:space="0"/>
+              <w:right w:val="single" w:color="000000" w:sz="4" w:space="0"/>
+            </w:tcBorders>
+            <w:vAlign w:val="center"/>
+          </w:tcPr>
+          <w:p>
+            <w:r>
+              <w:t/>
+            </w:r>
+          </w:p>
+        </w:tc>
+        <w:tc>
+          <w:tcPr>
+            <w:tcW w:w="860" w:type="dxa"/>
+            <w:tcBorders>
+              <w:top w:val="single" w:color="000000" w:sz="4" w:space="0"/>
+              <w:left w:val="single" w:color="000000" w:sz="4" w:space="0"/>
+              <w:bottom w:val="single" w:color="000000" w:sz="4" w:space="0"/>
+              <w:right w:val="single" w:color="000000" w:sz="4" w:space="0"/>
+            </w:tcBorders>
+            <w:vAlign w:val="center"/>
+          </w:tcPr>
+          <w:p>
+            <w:r>
+              <w:t/>
+            </w:r>
+          </w:p>
+        </w:tc>
+        <w:tc>
+          <w:tcPr>
+            <w:tcW w:w="1339" w:type="dxa"/>
+            <w:tcBorders>
+              <w:top w:val="single" w:color="000000" w:sz="4" w:space="0"/>
+              <w:left w:val="single" w:color="000000" w:sz="4" w:space="0"/>
+              <w:bottom w:val="single" w:color="000000" w:sz="4" w:space="0"/>
+              <w:right w:val="single" w:color="000000" w:sz="4" w:space="0"/>
+            </w:tcBorders>
+            <w:vAlign w:val="center"/>
+          </w:tcPr>
+          <w:p>
+            <w:r>
+              <w:t/>
+            </w:r>
+          </w:p>
+        </w:tc>
+        <w:tc>
+          <w:tcPr>
+            <w:tcW w:w="1265" w:type="dxa"/>
+            <w:tcBorders>
+              <w:top w:val="single" w:color="000000" w:sz="4" w:space="0"/>
+              <w:left w:val="single" w:color="000000" w:sz="4" w:space="0"/>
+              <w:bottom w:val="single" w:color="000000" w:sz="4" w:space="0"/>
+              <w:right w:val="single" w:color="000000" w:sz="4" w:space="0"/>
+            </w:tcBorders>
+            <w:vAlign w:val="center"/>
+          </w:tcPr>
+          <w:p>
+            <w:r>
+              <w:t/>
+            </w:r>
+          </w:p>
+        </w:tc>
+        <w:tc>
+          <w:tcPr>
+            <w:tcW w:w="1257" w:type="dxa"/>
+            <w:tcBorders>
+              <w:top w:val="single" w:color="000000" w:sz="4" w:space="0"/>
+              <w:left w:val="single" w:color="000000" w:sz="4" w:space="0"/>
+              <w:bottom w:val="single" w:color="000000" w:sz="4" w:space="0"/>
+              <w:right w:val="single" w:color="000000" w:sz="4" w:space="0"/>
+            </w:tcBorders>
+            <w:vAlign w:val="center"/>
+          </w:tcPr>
+          <w:p>
+            <w:r>
+              <w:t/>
+            </w:r>
+          </w:p>
+        </w:tc>
+      </w:tr>
+      <w:tr>
+        <w:tblPrEx>
+          <w:tblCellMar>
+            <w:top w:w="15" w:type="dxa"/>
+            <w:left w:w="15" w:type="dxa"/>
+            <w:bottom w:w="15" w:type="dxa"/>
+            <w:right w:w="15" w:type="dxa"/>
+          </w:tblCellMar>
+        </w:tblPrEx>
+        <w:trPr>
+          <w:trHeight w:val="373" w:hRule="atLeast"/>
+          <w:jc w:val="center"/>
+        </w:trPr>
+        <w:tc>
+          <w:tcPr>
+            <w:tcW w:w="560" w:type="dxa"/>
+            <w:tcBorders>
+              <w:top w:val="single" w:color="000000" w:sz="4" w:space="0"/>
+              <w:left w:val="single" w:color="000000" w:sz="4" w:space="0"/>
+              <w:bottom w:val="single" w:color="000000" w:sz="4" w:space="0"/>
+              <w:right w:val="single" w:color="000000" w:sz="4" w:space="0"/>
+            </w:tcBorders>
+            <w:vAlign w:val="center"/>
+          </w:tcPr>
+          <w:p>
+            <w:r>
+              <w:t>{{ item.index }}</w:t>
             </w:r>
           </w:p>
         </w:tc>
@@ -1140,7 +1289,156 @@
           </w:tcPr>
           <w:p>
             <w:r>
-              <w:t>{{ item.tagNo }}{% endfor %}</w:t>
+              <w:t>{{ item.tagNo }}</w:t>
+            </w:r>
+          </w:p>
+        </w:tc>
+      </w:tr>
+      <w:tr>
+        <w:tblPrEx>
+          <w:tblCellMar>
+            <w:top w:w="15" w:type="dxa"/>
+            <w:left w:w="15" w:type="dxa"/>
+            <w:bottom w:w="15" w:type="dxa"/>
+            <w:right w:w="15" w:type="dxa"/>
+          </w:tblCellMar>
+        </w:tblPrEx>
+        <w:trPr>
+          <w:trHeight w:val="373" w:hRule="atLeast"/>
+          <w:jc w:val="center"/>
+        </w:trPr>
+        <w:tc>
+          <w:tcPr>
+            <w:tcW w:w="560" w:type="dxa"/>
+            <w:tcBorders>
+              <w:top w:val="single" w:color="000000" w:sz="4" w:space="0"/>
+              <w:left w:val="single" w:color="000000" w:sz="4" w:space="0"/>
+              <w:bottom w:val="single" w:color="000000" w:sz="4" w:space="0"/>
+              <w:right w:val="single" w:color="000000" w:sz="4" w:space="0"/>
+            </w:tcBorders>
+            <w:vAlign w:val="center"/>
+          </w:tcPr>
+          <w:p>
+            <w:r>
+              <w:t>{%tr endfor %}</w:t>
+            </w:r>
+          </w:p>
+        </w:tc>
+        <w:tc>
+          <w:tcPr>
+            <w:tcW w:w="1323" w:type="dxa"/>
+            <w:tcBorders>
+              <w:top w:val="single" w:color="000000" w:sz="4" w:space="0"/>
+              <w:left w:val="single" w:color="000000" w:sz="4" w:space="0"/>
+              <w:right w:val="single" w:color="000000" w:sz="4" w:space="0"/>
+            </w:tcBorders>
+            <w:vAlign w:val="center"/>
+          </w:tcPr>
+          <w:p>
+            <w:r>
+              <w:t/>
+            </w:r>
+          </w:p>
+        </w:tc>
+        <w:tc>
+          <w:tcPr>
+            <w:tcW w:w="2154" w:type="dxa"/>
+            <w:tcBorders>
+              <w:top w:val="single" w:color="000000" w:sz="4" w:space="0"/>
+              <w:left w:val="single" w:color="000000" w:sz="4" w:space="0"/>
+              <w:bottom w:val="single" w:color="000000" w:sz="4" w:space="0"/>
+              <w:right w:val="single" w:color="000000" w:sz="4" w:space="0"/>
+            </w:tcBorders>
+            <w:vAlign w:val="center"/>
+          </w:tcPr>
+          <w:p>
+            <w:r>
+              <w:t/>
+            </w:r>
+          </w:p>
+        </w:tc>
+        <w:tc>
+          <w:tcPr>
+            <w:tcW w:w="743" w:type="dxa"/>
+            <w:tcBorders>
+              <w:top w:val="single" w:color="000000" w:sz="4" w:space="0"/>
+              <w:left w:val="single" w:color="000000" w:sz="4" w:space="0"/>
+              <w:bottom w:val="single" w:color="000000" w:sz="4" w:space="0"/>
+              <w:right w:val="single" w:color="000000" w:sz="4" w:space="0"/>
+            </w:tcBorders>
+            <w:vAlign w:val="center"/>
+          </w:tcPr>
+          <w:p>
+            <w:r>
+              <w:t/>
+            </w:r>
+          </w:p>
+        </w:tc>
+        <w:tc>
+          <w:tcPr>
+            <w:tcW w:w="860" w:type="dxa"/>
+            <w:tcBorders>
+              <w:top w:val="single" w:color="000000" w:sz="4" w:space="0"/>
+              <w:left w:val="single" w:color="000000" w:sz="4" w:space="0"/>
+              <w:bottom w:val="single" w:color="000000" w:sz="4" w:space="0"/>
+              <w:right w:val="single" w:color="000000" w:sz="4" w:space="0"/>
+            </w:tcBorders>
+            <w:vAlign w:val="center"/>
+          </w:tcPr>
+          <w:p>
+            <w:r>
+              <w:t/>
+            </w:r>
+          </w:p>
+        </w:tc>
+        <w:tc>
+          <w:tcPr>
+            <w:tcW w:w="1339" w:type="dxa"/>
+            <w:tcBorders>
+              <w:top w:val="single" w:color="000000" w:sz="4" w:space="0"/>
+              <w:left w:val="single" w:color="000000" w:sz="4" w:space="0"/>
+              <w:bottom w:val="single" w:color="000000" w:sz="4" w:space="0"/>
+              <w:right w:val="single" w:color="000000" w:sz="4" w:space="0"/>
+            </w:tcBorders>
+            <w:vAlign w:val="center"/>
+          </w:tcPr>
+          <w:p>
+            <w:r>
+              <w:t/>
+            </w:r>
+          </w:p>
+        </w:tc>
+        <w:tc>
+          <w:tcPr>
+            <w:tcW w:w="1265" w:type="dxa"/>
+            <w:tcBorders>
+              <w:top w:val="single" w:color="000000" w:sz="4" w:space="0"/>
+              <w:left w:val="single" w:color="000000" w:sz="4" w:space="0"/>
+              <w:bottom w:val="single" w:color="000000" w:sz="4" w:space="0"/>
+              <w:right w:val="single" w:color="000000" w:sz="4" w:space="0"/>
+            </w:tcBorders>
+            <w:vAlign w:val="center"/>
+          </w:tcPr>
+          <w:p>
+            <w:r>
+              <w:t/>
+            </w:r>
+          </w:p>
+        </w:tc>
+        <w:tc>
+          <w:tcPr>
+            <w:tcW w:w="1257" w:type="dxa"/>
+            <w:tcBorders>
+              <w:top w:val="single" w:color="000000" w:sz="4" w:space="0"/>
+              <w:left w:val="single" w:color="000000" w:sz="4" w:space="0"/>
+              <w:bottom w:val="single" w:color="000000" w:sz="4" w:space="0"/>
+              <w:right w:val="single" w:color="000000" w:sz="4" w:space="0"/>
+            </w:tcBorders>
+            <w:vAlign w:val="center"/>
+          </w:tcPr>
+          <w:p>
+            <w:r>
+              <w:t/>
             </w:r>
           </w:p>
         </w:tc>

</xml_diff>